<commit_message>
Denemeleri örnek düzene getir: cevap anahtarı ve gerekçeli çözümler
Her deneme artık tek bir tam dosya (DENEME-n.docx/.pdf):
- Kapak ve Sınav Bilgileri (set, model, blok düzeni, zorluk, çıkmış bilgi alanı sayısı)
- Bölüm A soru kitapçığı
- Cevap Anahtarı: 20'şerli beş tablo
- Bölüm B: her soru ders – konu etiketiyle yeniden; Doğru Cevap ve
  "Bu nedenle doğru cevap X seçeneğidir. (MD dayanak)" ile biten Gerekçe
- Dağılım (harf, zorluk, soru kalıbı, konu), Üretim Notu, Hafıza Güncellemesi

Soru kitapçıkları aynı biçimde yeniden üretildi. Eski
CEVAP-ANAHTARI-VE-COZUMLER dosyaları kaldırıldı. Zorluk (10/20/40/20/10),
soru kalıbı, ölçülen bilgi özeti ve çıkmış soru karşılığı etiketleri ile
Word üretim betikleri uretim-kayitlari altına eklendi.

Co-Authored-By: Claude Opus 5.5 <noreply@anthropic.com>
Claude-Session: https://claude.ai/code/session_01GgDEz86kKogUAFjPuHAFPg
</commit_message>
<xml_diff>
--- a/01-DENEME-SINAVLARI/00-OKU-BENI.docx
+++ b/01-DENEME-SINAVLARI/00-OKU-BENI.docx
@@ -2,7 +2,7 @@
 <file path=word/document.xml><?xml version="1.0" encoding="utf-8"?>
 <w:document xmlns:w="http://schemas.openxmlformats.org/wordprocessingml/2006/main" xmlns:m="http://schemas.openxmlformats.org/officeDocument/2006/math" xmlns:r="http://schemas.openxmlformats.org/officeDocument/2006/relationships" xmlns:o="urn:schemas-microsoft-com:office:office" xmlns:v="urn:schemas-microsoft-com:vml" xmlns:w10="urn:schemas-microsoft-com:office:word" xmlns:a="http://schemas.openxmlformats.org/drawingml/2006/main" xmlns:pic="http://schemas.openxmlformats.org/drawingml/2006/picture" xmlns:wp="http://schemas.openxmlformats.org/drawingml/2006/wordprocessingDrawing">
   <w:body>
-    <w:bookmarkStart w:id="26" w:name="Xd19d6eae67a548e3c1c107560666982c8743528"/>
+    <w:bookmarkStart w:id="27" w:name="Xd19d6eae67a548e3c1c107560666982c8743528"/>
     <w:p>
       <w:pPr>
         <w:pStyle w:val="Heading1"/>
@@ -28,7 +28,7 @@
         <w:t xml:space="preserve">) göre kuruldu: alan dağılımı, blok düzeni, konu ağırlıkları ve soru tipleri gerçek sınavı izliyor.</w:t>
       </w:r>
     </w:p>
-    <w:bookmarkStart w:id="20" w:name="dosyalar"/>
+    <w:bookmarkStart w:id="21" w:name="dosyalar"/>
     <w:p>
       <w:pPr>
         <w:pStyle w:val="Heading2"/>
@@ -45,8 +45,8 @@
         <w:jc w:val="start"/>
       </w:tblPr>
       <w:tblGrid>
-        <w:gridCol w:w="3300"/>
-        <w:gridCol w:w="4620"/>
+        <w:gridCol w:w="2904"/>
+        <w:gridCol w:w="5016"/>
       </w:tblGrid>
       <w:tr>
         <w:trPr>
@@ -89,25 +89,35 @@
               <w:rPr>
                 <w:rStyle w:val="VerbatimChar"/>
               </w:rPr>
-              <w:t xml:space="preserve">DENEME-1_SORU-KITAPCIGI</w:t>
+              <w:t xml:space="preserve">DENEME-1</w:t>
             </w:r>
             <w:r>
               <w:t xml:space="preserve"> </w:t>
             </w:r>
             <w:r>
-              <w:t xml:space="preserve">(.pdf / .docx / .md)</w:t>
-            </w:r>
-          </w:p>
-        </w:tc>
-        <w:tc>
-          <w:tcPr/>
-          <w:p>
-            <w:pPr>
-              <w:pStyle w:val="Compact"/>
-              <w:jc w:val="left"/>
-            </w:pPr>
-            <w:r>
-              <w:t xml:space="preserve">Deneme 1 — yalnız sorular; yazdırıp 150 dakikada çözmek için</w:t>
+              <w:t xml:space="preserve">(.pdf / .docx)</w:t>
+            </w:r>
+          </w:p>
+        </w:tc>
+        <w:tc>
+          <w:tcPr/>
+          <w:p>
+            <w:pPr>
+              <w:pStyle w:val="Compact"/>
+              <w:jc w:val="left"/>
+            </w:pPr>
+            <w:r>
+              <w:rPr>
+                <w:bCs/>
+                <w:b/>
+              </w:rPr>
+              <w:t xml:space="preserve">Tam deneme.</w:t>
+            </w:r>
+            <w:r>
+              <w:t xml:space="preserve"> </w:t>
+            </w:r>
+            <w:r>
+              <w:t xml:space="preserve">Kapak, Sınav Bilgileri, Bölüm A (soru kitapçığı), Cevap Anahtarı, Bölüm B (cevaplı ve gerekçeli sorular), Dağılım, Üretim Notu, Hafıza Güncellemesi</w:t>
             </w:r>
           </w:p>
         </w:tc>
@@ -124,7 +134,7 @@
               <w:rPr>
                 <w:rStyle w:val="VerbatimChar"/>
               </w:rPr>
-              <w:t xml:space="preserve">DENEME-1_CEVAP-ANAHTARI-VE-COZUMLER</w:t>
+              <w:t xml:space="preserve">DENEME-1_SORU-KITAPCIGI</w:t>
             </w:r>
             <w:r>
               <w:t xml:space="preserve"> </w:t>
@@ -142,7 +152,7 @@
               <w:jc w:val="left"/>
             </w:pPr>
             <w:r>
-              <w:t xml:space="preserve">Cevap anahtarı, denemenin yapısı ve 100 sorunun açıklamalı çözümü (gerekçe, tuzak, dayanak)</w:t>
+              <w:t xml:space="preserve">Yalnız sorular (kapak + Sınav Bilgileri + Bölüm A); yazdırıp 150 dakikada çözmek için</w:t>
             </w:r>
           </w:p>
         </w:tc>
@@ -159,7 +169,7 @@
               <w:rPr>
                 <w:rStyle w:val="VerbatimChar"/>
               </w:rPr>
-              <w:t xml:space="preserve">DENEME-2_…</w:t>
+              <w:t xml:space="preserve">DENEME-2…</w:t>
             </w:r>
             <w:r>
               <w:t xml:space="preserve">,</w:t>
@@ -171,7 +181,7 @@
               <w:rPr>
                 <w:rStyle w:val="VerbatimChar"/>
               </w:rPr>
-              <w:t xml:space="preserve">DENEME-3_…</w:t>
+              <w:t xml:space="preserve">DENEME-3…</w:t>
             </w:r>
           </w:p>
         </w:tc>
@@ -227,7 +237,7 @@
               <w:jc w:val="left"/>
             </w:pPr>
             <w:r>
-              <w:t xml:space="preserve">Soruların makine verisi (no, cevap, alan, konu, alt tip, açıklama, dayanak)</w:t>
+              <w:t xml:space="preserve">Soruların makine verisi (no, cevap, alan, konu, alt tip, açıklama, tuzak, dayanak)</w:t>
             </w:r>
           </w:p>
         </w:tc>
@@ -256,20 +266,19 @@
               <w:jc w:val="left"/>
             </w:pPr>
             <w:r>
-              <w:t xml:space="preserve">Plan, ajan talimatları, doğrulama ve çapraz kontrol raporları (denemelerin nasıl üretildiğinin kaydı)</w:t>
+              <w:t xml:space="preserve">Plan, ajan talimatları, doğrulama ve çapraz kontrol raporları, zorluk etiketleri ve betikler (denemelerin nasıl üretildiğinin kaydı)</w:t>
             </w:r>
           </w:p>
         </w:tc>
       </w:tr>
     </w:tbl>
-    <w:bookmarkEnd w:id="20"/>
-    <w:bookmarkStart w:id="21" w:name="nasıl-kullanılır"/>
-    <w:p>
-      <w:pPr>
-        <w:pStyle w:val="Heading2"/>
-      </w:pPr>
-      <w:r>
-        <w:t xml:space="preserve">Nasıl kullanılır?</w:t>
+    <w:bookmarkStart w:id="20" w:name="tam-deneme-dosyasının-bölümleri"/>
+    <w:p>
+      <w:pPr>
+        <w:pStyle w:val="Heading3"/>
+      </w:pPr>
+      <w:r>
+        <w:t xml:space="preserve">Tam deneme dosyasının bölümleri</w:t>
       </w:r>
     </w:p>
     <w:p>
@@ -281,7 +290,17 @@
         <w:pStyle w:val="Compact"/>
       </w:pPr>
       <w:r>
-        <w:t xml:space="preserve">Soru kitapçığının PDF’ini yazdır; 150 dakika süre tut. Gerçek sınavda olduğu gibi yanlışlar doğruları götürmez.</w:t>
+        <w:rPr>
+          <w:bCs/>
+          <w:b/>
+        </w:rPr>
+        <w:t xml:space="preserve">Cevap Anahtarı:</w:t>
+      </w:r>
+      <w:r>
+        <w:t xml:space="preserve"> </w:t>
+      </w:r>
+      <w:r>
+        <w:t xml:space="preserve">100 soru, 20’şerli beş tabloda (üst satır soru no, alt satır doğru şık).</w:t>
       </w:r>
     </w:p>
     <w:p>
@@ -293,19 +312,64 @@
         <w:pStyle w:val="Compact"/>
       </w:pPr>
       <w:r>
-        <w:t xml:space="preserve">Bitirince cevap anahtarından puanla. Çözümler dosyasında her sorunun altında alanı, konusu ve soru tipi kodu (O1, O2, Ö3, H1… — açıklaması</w:t>
-      </w:r>
-      <w:r>
-        <w:t xml:space="preserve"> </w:t>
-      </w:r>
-      <w:r>
-        <w:rPr>
-          <w:rStyle w:val="VerbatimChar"/>
-        </w:rPr>
-        <w:t xml:space="preserve">12-SORU-TIPI-KATALOGU</w:t>
-      </w:r>
-      <w:r>
-        <w:t xml:space="preserve">) yazıyor.</w:t>
+        <w:rPr>
+          <w:bCs/>
+          <w:b/>
+        </w:rPr>
+        <w:t xml:space="preserve">Bölüm B — Cevaplı ve Gerekçeli Sorular:</w:t>
+      </w:r>
+      <w:r>
+        <w:t xml:space="preserve"> </w:t>
+      </w:r>
+      <w:r>
+        <w:t xml:space="preserve">Her soru şıklarıyla birlikte yeniden yer alır. Sorunun üstündeki italik satır ders ve konuyu gösterir. Sorunun altında</w:t>
+      </w:r>
+      <w:r>
+        <w:t xml:space="preserve"> </w:t>
+      </w:r>
+      <w:r>
+        <w:rPr>
+          <w:bCs/>
+          <w:b/>
+        </w:rPr>
+        <w:t xml:space="preserve">Doğru Cevap</w:t>
+      </w:r>
+      <w:r>
+        <w:t xml:space="preserve"> </w:t>
+      </w:r>
+      <w:r>
+        <w:t xml:space="preserve">ve</w:t>
+      </w:r>
+      <w:r>
+        <w:t xml:space="preserve"> </w:t>
+      </w:r>
+      <w:r>
+        <w:rPr>
+          <w:bCs/>
+          <w:b/>
+        </w:rPr>
+        <w:t xml:space="preserve">Gerekçe</w:t>
+      </w:r>
+      <w:r>
+        <w:t xml:space="preserve"> </w:t>
+      </w:r>
+      <w:r>
+        <w:t xml:space="preserve">vardır. Gerekçe, doğru şıkkın neden doğru, diğerlerinin neden yanlış olduğunu açıklar ve şu kapanışla biter:</w:t>
+      </w:r>
+      <w:r>
+        <w:t xml:space="preserve"> </w:t>
+      </w:r>
+      <w:r>
+        <w:t xml:space="preserve">“</w:t>
+      </w:r>
+      <w:r>
+        <w:t xml:space="preserve">Bu nedenle doğru cevap X seçeneğidir. (MD …)</w:t>
+      </w:r>
+      <w:r>
+        <w:t xml:space="preserve">”</w:t>
+      </w:r>
+      <w:r>
+        <w:t xml:space="preserve">. MD, mevzuat dayanağıdır (kanun, yönetmelik, tebliğ, karar maddesi; tarife sorularında fasıl/pozisyon notu ve GYKK). Hesap sorularında gerekçe, çözüm adımlarını ve her yanlış şıkkın hangi hatadan türediğini içerir.</w:t>
       </w:r>
     </w:p>
     <w:p>
@@ -317,7 +381,17 @@
         <w:pStyle w:val="Compact"/>
       </w:pPr>
       <w:r>
-        <w:t xml:space="preserve">Yanlışlarını konu ve tipe göre grupla: hangi konuda bilgi eksiğin, hangi tipte okuma hatan var, ayrı ayrı görürsün.</w:t>
+        <w:rPr>
+          <w:bCs/>
+          <w:b/>
+        </w:rPr>
+        <w:t xml:space="preserve">Dağılım:</w:t>
+      </w:r>
+      <w:r>
+        <w:t xml:space="preserve"> </w:t>
+      </w:r>
+      <w:r>
+        <w:t xml:space="preserve">Doğru cevap harfi, zorluk (ÇK çok kolay · K kolay · O orta · Z zor · ÇZ çok zor) ve soru kalıbı (HESAP, OLAY, YANLIŞ, ÖNERMELİ, EŞLEŞTİRME…) sayıları, konu tablosu.</w:t>
       </w:r>
     </w:p>
     <w:p>
@@ -329,41 +403,229 @@
         <w:pStyle w:val="Compact"/>
       </w:pPr>
       <w:r>
-        <w:t xml:space="preserve">Denemeleri arayla çöz (ör. 1 → 2 hafta çalışma → 2 → …).</w:t>
-      </w:r>
-    </w:p>
-    <w:bookmarkEnd w:id="21"/>
-    <w:bookmarkStart w:id="22" w:name="denemelerin-yapısı"/>
-    <w:p>
-      <w:pPr>
-        <w:pStyle w:val="Heading2"/>
-      </w:pPr>
-      <w:r>
-        <w:t xml:space="preserve">Denemelerin yapısı</w:t>
-      </w:r>
-    </w:p>
-    <w:p>
-      <w:pPr>
-        <w:pStyle w:val="FirstParagraph"/>
-      </w:pPr>
-      <w:r>
-        <w:t xml:space="preserve">Her denemede:</w:t>
-      </w:r>
-      <w:r>
-        <w:t xml:space="preserve"> </w:t>
-      </w:r>
-      <w:r>
         <w:rPr>
           <w:bCs/>
           <w:b/>
         </w:rPr>
+        <w:t xml:space="preserve">Hafıza Güncellemesi:</w:t>
+      </w:r>
+      <w:r>
+        <w:t xml:space="preserve"> </w:t>
+      </w:r>
+      <w:r>
+        <w:t xml:space="preserve">Her soru için tek satır:</w:t>
+      </w:r>
+      <w:r>
+        <w:t xml:space="preserve"> </w:t>
+      </w:r>
+      <w:r>
+        <w:rPr>
+          <w:rStyle w:val="VerbatimChar"/>
+        </w:rPr>
+        <w:t xml:space="preserve">GM1-001 | ders | konu | ölçülen bilgi | kalıp | zorluk | cevap | set</w:t>
+      </w:r>
+      <w:r>
+        <w:t xml:space="preserve">. Yanlışlarını bu satırlardan tabloya aktarıp izleyebilirsin.</w:t>
+      </w:r>
+    </w:p>
+    <w:p>
+      <w:pPr>
+        <w:numPr>
+          <w:ilvl w:val="0"/>
+          <w:numId w:val="1001"/>
+        </w:numPr>
+        <w:pStyle w:val="Compact"/>
+      </w:pPr>
+      <w:r>
+        <w:t xml:space="preserve">Her sorunun ölçtüğü bilgi alanının en yakın çıkmış karşılığı (ör.</w:t>
+      </w:r>
+      <w:r>
+        <w:t xml:space="preserve"> </w:t>
+      </w:r>
+      <w:r>
+        <w:rPr>
+          <w:rStyle w:val="VerbatimChar"/>
+        </w:rPr>
+        <w:t xml:space="preserve">2024/61</w:t>
+      </w:r>
+      <w:r>
+        <w:t xml:space="preserve">)</w:t>
+      </w:r>
+      <w:r>
+        <w:t xml:space="preserve"> </w:t>
+      </w:r>
+      <w:r>
+        <w:rPr>
+          <w:rStyle w:val="VerbatimChar"/>
+        </w:rPr>
+        <w:t xml:space="preserve">uretim-kayitlari/derece/deneme&lt;n&gt;.json</w:t>
+      </w:r>
+      <w:r>
+        <w:t xml:space="preserve"> </w:t>
+      </w:r>
+      <w:r>
+        <w:t xml:space="preserve">dosyalarının</w:t>
+      </w:r>
+      <w:r>
+        <w:t xml:space="preserve"> </w:t>
+      </w:r>
+      <w:r>
+        <w:rPr>
+          <w:rStyle w:val="VerbatimChar"/>
+        </w:rPr>
+        <w:t xml:space="preserve">cikmis</w:t>
+      </w:r>
+      <w:r>
+        <w:t xml:space="preserve"> </w:t>
+      </w:r>
+      <w:r>
+        <w:t xml:space="preserve">alanında. Çıkmış bir bilgi alanına karşılık gelen soru sayısı: Deneme 1’de 71, Deneme 2’de 59, Deneme 3’te 67.</w:t>
+      </w:r>
+    </w:p>
+    <w:bookmarkEnd w:id="20"/>
+    <w:bookmarkEnd w:id="21"/>
+    <w:bookmarkStart w:id="22" w:name="nasıl-kullanılır"/>
+    <w:p>
+      <w:pPr>
+        <w:pStyle w:val="Heading2"/>
+      </w:pPr>
+      <w:r>
+        <w:t xml:space="preserve">Nasıl kullanılır?</w:t>
+      </w:r>
+    </w:p>
+    <w:p>
+      <w:pPr>
+        <w:numPr>
+          <w:ilvl w:val="0"/>
+          <w:numId w:val="1002"/>
+        </w:numPr>
+        <w:pStyle w:val="Compact"/>
+      </w:pPr>
+      <w:r>
+        <w:t xml:space="preserve">Soru kitapçığının PDF’ini yazdır; 150 dakika süre tut. Gerçek sınavda olduğu gibi yanlışlar doğruları götürmez.</w:t>
+      </w:r>
+    </w:p>
+    <w:p>
+      <w:pPr>
+        <w:numPr>
+          <w:ilvl w:val="0"/>
+          <w:numId w:val="1002"/>
+        </w:numPr>
+        <w:pStyle w:val="Compact"/>
+      </w:pPr>
+      <w:r>
+        <w:t xml:space="preserve">Bitirince tam deneme dosyasındaki</w:t>
+      </w:r>
+      <w:r>
+        <w:t xml:space="preserve"> </w:t>
+      </w:r>
+      <w:r>
+        <w:rPr>
+          <w:bCs/>
+          <w:b/>
+        </w:rPr>
+        <w:t xml:space="preserve">Cevap Anahtarı</w:t>
+      </w:r>
+      <w:r>
+        <w:t xml:space="preserve">ndan puanla, sonra</w:t>
+      </w:r>
+      <w:r>
+        <w:t xml:space="preserve"> </w:t>
+      </w:r>
+      <w:r>
+        <w:rPr>
+          <w:bCs/>
+          <w:b/>
+        </w:rPr>
+        <w:t xml:space="preserve">Bölüm B</w:t>
+      </w:r>
+      <w:r>
+        <w:t xml:space="preserve">’de yanlış ve boş bıraktığın soruların gerekçesini oku.</w:t>
+      </w:r>
+    </w:p>
+    <w:p>
+      <w:pPr>
+        <w:numPr>
+          <w:ilvl w:val="0"/>
+          <w:numId w:val="1002"/>
+        </w:numPr>
+        <w:pStyle w:val="Compact"/>
+      </w:pPr>
+      <w:r>
+        <w:t xml:space="preserve">Yanlışlarını konu, zorluk ve kalıba göre grupla (Hafıza Güncellemesi satırları bunun için). Hangi konuda bilgi eksiğin, hangi kalıpta okuma hatan var, ayrı ayrı görürsün. Alt tip kodları (O1, O2, Ö3, H1… açıklaması</w:t>
+      </w:r>
+      <w:r>
+        <w:t xml:space="preserve"> </w:t>
+      </w:r>
+      <w:r>
+        <w:rPr>
+          <w:rStyle w:val="VerbatimChar"/>
+        </w:rPr>
+        <w:t xml:space="preserve">12-SORU-TIPI-KATALOGU</w:t>
+      </w:r>
+      <w:r>
+        <w:t xml:space="preserve">)</w:t>
+      </w:r>
+      <w:r>
+        <w:t xml:space="preserve"> </w:t>
+      </w:r>
+      <w:r>
+        <w:rPr>
+          <w:rStyle w:val="VerbatimChar"/>
+        </w:rPr>
+        <w:t xml:space="preserve">veri/</w:t>
+      </w:r>
+      <w:r>
+        <w:t xml:space="preserve"> </w:t>
+      </w:r>
+      <w:r>
+        <w:t xml:space="preserve">dosyalarında.</w:t>
+      </w:r>
+    </w:p>
+    <w:p>
+      <w:pPr>
+        <w:numPr>
+          <w:ilvl w:val="0"/>
+          <w:numId w:val="1002"/>
+        </w:numPr>
+        <w:pStyle w:val="Compact"/>
+      </w:pPr>
+      <w:r>
+        <w:t xml:space="preserve">Denemeleri arayla çöz (ör. 1 → 2 hafta çalışma → 2 → …).</w:t>
+      </w:r>
+    </w:p>
+    <w:bookmarkEnd w:id="22"/>
+    <w:bookmarkStart w:id="23" w:name="denemelerin-yapısı"/>
+    <w:p>
+      <w:pPr>
+        <w:pStyle w:val="Heading2"/>
+      </w:pPr>
+      <w:r>
+        <w:t xml:space="preserve">Denemelerin yapısı</w:t>
+      </w:r>
+    </w:p>
+    <w:p>
+      <w:pPr>
+        <w:pStyle w:val="FirstParagraph"/>
+      </w:pPr>
+      <w:r>
+        <w:t xml:space="preserve">Her denemede:</w:t>
+      </w:r>
+      <w:r>
+        <w:t xml:space="preserve"> </w:t>
+      </w:r>
+      <w:r>
+        <w:rPr>
+          <w:bCs/>
+          <w:b/>
+        </w:rPr>
         <w:t xml:space="preserve">42 Gümrük Mevzuatı · 30 Sair Mevzuat · 17 Tarife · 11 Hesap.</w:t>
       </w:r>
       <w:r>
         <w:t xml:space="preserve"> </w:t>
       </w:r>
       <w:r>
-        <w:t xml:space="preserve">Her harf 20 kez doğru cevap; aynı harf en fazla 3 kez üst üste.</w:t>
+        <w:t xml:space="preserve">Her harf 20 kez doğru cevap; aynı harf en fazla 3 kez üst üste. Zorluk göreli olarak dağıtıldı: 10 çok kolay, 20 kolay, 40 orta, 20 zor, 10 çok zor.</w:t>
       </w:r>
     </w:p>
     <w:tbl>
@@ -787,8 +1049,8 @@
         <w:t xml:space="preserve">Konu ağırlıkları 2021–2025 frekanslarından, soru tipleri katalogdaki deneme reçetesinden geldi. Küçük konular (tasfiye, yatırım teşvik, ticaret politikası önlemleri, 1/95 OKK, genel hükümler) denemeler arasında dönüşümlü dağıtıldı. Üç deneme arasında aynı bilginin tekrarı en aza indirildi (fark edilen iki küçük tekrar farklı denemelerde ve farklı kurguyla duruyor).</w:t>
       </w:r>
     </w:p>
-    <w:bookmarkEnd w:id="22"/>
-    <w:bookmarkStart w:id="23" w:name="nasıl-hazırlandı"/>
+    <w:bookmarkEnd w:id="23"/>
+    <w:bookmarkStart w:id="24" w:name="nasıl-hazırlandı"/>
     <w:p>
       <w:pPr>
         <w:pStyle w:val="Heading2"/>
@@ -801,7 +1063,7 @@
       <w:pPr>
         <w:numPr>
           <w:ilvl w:val="0"/>
-          <w:numId w:val="1002"/>
+          <w:numId w:val="1003"/>
         </w:numPr>
         <w:pStyle w:val="Compact"/>
       </w:pPr>
@@ -823,7 +1085,7 @@
       <w:pPr>
         <w:numPr>
           <w:ilvl w:val="0"/>
-          <w:numId w:val="1002"/>
+          <w:numId w:val="1003"/>
         </w:numPr>
         <w:pStyle w:val="Compact"/>
       </w:pPr>
@@ -845,7 +1107,7 @@
       <w:pPr>
         <w:numPr>
           <w:ilvl w:val="0"/>
-          <w:numId w:val="1002"/>
+          <w:numId w:val="1003"/>
         </w:numPr>
         <w:pStyle w:val="Compact"/>
       </w:pPr>
@@ -867,7 +1129,7 @@
       <w:pPr>
         <w:numPr>
           <w:ilvl w:val="0"/>
-          <w:numId w:val="1002"/>
+          <w:numId w:val="1003"/>
         </w:numPr>
         <w:pStyle w:val="Compact"/>
       </w:pPr>
@@ -885,8 +1147,8 @@
         <w:t xml:space="preserve">Her deneme 100 sorusuyla baştan sona çözüldü. Anahtar hatası çıkmadı; 25 sorunda deneme içi sızıntı (bir sorunun başka sorunun cevabını vermesi), tekrar ya da biçim sorunu giderildi, 2 soru yeniden yazıldı.</w:t>
       </w:r>
     </w:p>
-    <w:bookmarkEnd w:id="23"/>
-    <w:bookmarkStart w:id="24" w:name="X7c03974bc01c71dac01aa3db3b53f2e58b589d1"/>
+    <w:bookmarkEnd w:id="24"/>
+    <w:bookmarkStart w:id="25" w:name="X7c03974bc01c71dac01aa3db3b53f2e58b589d1"/>
     <w:p>
       <w:pPr>
         <w:pStyle w:val="Heading2"/>
@@ -907,7 +1169,7 @@
       <w:pPr>
         <w:numPr>
           <w:ilvl w:val="0"/>
-          <w:numId w:val="1003"/>
+          <w:numId w:val="1004"/>
         </w:numPr>
         <w:pStyle w:val="Compact"/>
       </w:pPr>
@@ -929,7 +1191,7 @@
       <w:pPr>
         <w:numPr>
           <w:ilvl w:val="0"/>
-          <w:numId w:val="1003"/>
+          <w:numId w:val="1004"/>
         </w:numPr>
         <w:pStyle w:val="Compact"/>
       </w:pPr>
@@ -951,7 +1213,7 @@
       <w:pPr>
         <w:numPr>
           <w:ilvl w:val="0"/>
-          <w:numId w:val="1003"/>
+          <w:numId w:val="1004"/>
         </w:numPr>
         <w:pStyle w:val="Compact"/>
       </w:pPr>
@@ -973,7 +1235,7 @@
       <w:pPr>
         <w:numPr>
           <w:ilvl w:val="0"/>
-          <w:numId w:val="1003"/>
+          <w:numId w:val="1004"/>
         </w:numPr>
         <w:pStyle w:val="Compact"/>
       </w:pPr>
@@ -995,7 +1257,7 @@
       <w:pPr>
         <w:numPr>
           <w:ilvl w:val="0"/>
-          <w:numId w:val="1003"/>
+          <w:numId w:val="1004"/>
         </w:numPr>
         <w:pStyle w:val="Compact"/>
       </w:pPr>
@@ -1017,7 +1279,7 @@
       <w:pPr>
         <w:numPr>
           <w:ilvl w:val="0"/>
-          <w:numId w:val="1003"/>
+          <w:numId w:val="1004"/>
         </w:numPr>
         <w:pStyle w:val="Compact"/>
       </w:pPr>
@@ -1039,7 +1301,7 @@
       <w:pPr>
         <w:numPr>
           <w:ilvl w:val="0"/>
-          <w:numId w:val="1003"/>
+          <w:numId w:val="1004"/>
         </w:numPr>
         <w:pStyle w:val="Compact"/>
       </w:pPr>
@@ -1061,7 +1323,7 @@
       <w:pPr>
         <w:numPr>
           <w:ilvl w:val="0"/>
-          <w:numId w:val="1003"/>
+          <w:numId w:val="1004"/>
         </w:numPr>
         <w:pStyle w:val="Compact"/>
       </w:pPr>
@@ -1083,7 +1345,7 @@
       <w:pPr>
         <w:numPr>
           <w:ilvl w:val="0"/>
-          <w:numId w:val="1003"/>
+          <w:numId w:val="1004"/>
         </w:numPr>
         <w:pStyle w:val="Compact"/>
       </w:pPr>
@@ -1105,7 +1367,7 @@
       <w:pPr>
         <w:numPr>
           <w:ilvl w:val="0"/>
-          <w:numId w:val="1003"/>
+          <w:numId w:val="1004"/>
         </w:numPr>
         <w:pStyle w:val="Compact"/>
       </w:pPr>
@@ -1127,7 +1389,7 @@
       <w:pPr>
         <w:numPr>
           <w:ilvl w:val="0"/>
-          <w:numId w:val="1003"/>
+          <w:numId w:val="1004"/>
         </w:numPr>
         <w:pStyle w:val="Compact"/>
       </w:pPr>
@@ -1145,8 +1407,8 @@
         <w:t xml:space="preserve">kaynaklarda çelişkili değerler var (185.000 TL / 25.000 TL); bu yüzden denemelerde doğru cevap yapılmadı.</w:t>
       </w:r>
     </w:p>
-    <w:bookmarkEnd w:id="24"/>
-    <w:bookmarkStart w:id="25" w:name="sınırlılıklar"/>
+    <w:bookmarkEnd w:id="25"/>
+    <w:bookmarkStart w:id="26" w:name="sınırlılıklar"/>
     <w:p>
       <w:pPr>
         <w:pStyle w:val="Heading2"/>
@@ -1159,7 +1421,7 @@
       <w:pPr>
         <w:numPr>
           <w:ilvl w:val="0"/>
-          <w:numId w:val="1004"/>
+          <w:numId w:val="1005"/>
         </w:numPr>
         <w:pStyle w:val="Compact"/>
       </w:pPr>
@@ -1187,76 +1449,76 @@
       <w:pPr>
         <w:numPr>
           <w:ilvl w:val="1"/>
+          <w:numId w:val="1006"/>
+        </w:numPr>
+        <w:pStyle w:val="Compact"/>
+      </w:pPr>
+      <w:r>
+        <w:t xml:space="preserve">Deneme 1: 3, 4, 27, 29, 36</w:t>
+      </w:r>
+    </w:p>
+    <w:p>
+      <w:pPr>
+        <w:numPr>
+          <w:ilvl w:val="1"/>
+          <w:numId w:val="1006"/>
+        </w:numPr>
+        <w:pStyle w:val="Compact"/>
+      </w:pPr>
+      <w:r>
+        <w:t xml:space="preserve">Deneme 2: 38, 39, 41</w:t>
+      </w:r>
+    </w:p>
+    <w:p>
+      <w:pPr>
+        <w:numPr>
+          <w:ilvl w:val="1"/>
+          <w:numId w:val="1006"/>
+        </w:numPr>
+        <w:pStyle w:val="Compact"/>
+      </w:pPr>
+      <w:r>
+        <w:t xml:space="preserve">Deneme 3: 49, 50, 54, 55, 56, 57, 78, 79</w:t>
+      </w:r>
+    </w:p>
+    <w:p>
+      <w:pPr>
+        <w:numPr>
+          <w:ilvl w:val="0"/>
           <w:numId w:val="1005"/>
         </w:numPr>
         <w:pStyle w:val="Compact"/>
       </w:pPr>
       <w:r>
-        <w:t xml:space="preserve">Deneme 1: 3, 4, 27, 29, 36</w:t>
-      </w:r>
-    </w:p>
-    <w:p>
-      <w:pPr>
-        <w:numPr>
-          <w:ilvl w:val="1"/>
+        <w:t xml:space="preserve">Mevzuat durumu, depodaki kaynak dosyalardaki hâldir (son görülen değişiklik Temmuz 2026). Sınavdan önce yürürlüğe girecek değişiklikler sorularda yok.</w:t>
+      </w:r>
+    </w:p>
+    <w:p>
+      <w:pPr>
+        <w:numPr>
+          <w:ilvl w:val="0"/>
           <w:numId w:val="1005"/>
         </w:numPr>
         <w:pStyle w:val="Compact"/>
       </w:pPr>
       <w:r>
-        <w:t xml:space="preserve">Deneme 2: 38, 39, 41</w:t>
-      </w:r>
-    </w:p>
-    <w:p>
-      <w:pPr>
-        <w:numPr>
-          <w:ilvl w:val="1"/>
+        <w:t xml:space="preserve">Yıllık güncellenen tutarlar (asgari ücret tarifesi, yeniden değerleme tutarları, tecil eşikleri) doğru cevap yapılmadı; gerektiğinde tutar soruda veri olarak verildi.</w:t>
+      </w:r>
+    </w:p>
+    <w:p>
+      <w:pPr>
+        <w:numPr>
+          <w:ilvl w:val="0"/>
           <w:numId w:val="1005"/>
         </w:numPr>
         <w:pStyle w:val="Compact"/>
       </w:pPr>
       <w:r>
-        <w:t xml:space="preserve">Deneme 3: 49, 50, 54, 55, 56, 57, 78, 79</w:t>
-      </w:r>
-    </w:p>
-    <w:p>
-      <w:pPr>
-        <w:numPr>
-          <w:ilvl w:val="0"/>
-          <w:numId w:val="1004"/>
-        </w:numPr>
-        <w:pStyle w:val="Compact"/>
-      </w:pPr>
-      <w:r>
-        <w:t xml:space="preserve">Mevzuat durumu, depodaki kaynak dosyalardaki hâldir (son görülen değişiklik Temmuz 2026). Sınavdan önce yürürlüğe girecek değişiklikler sorularda yok.</w:t>
-      </w:r>
-    </w:p>
-    <w:p>
-      <w:pPr>
-        <w:numPr>
-          <w:ilvl w:val="0"/>
-          <w:numId w:val="1004"/>
-        </w:numPr>
-        <w:pStyle w:val="Compact"/>
-      </w:pPr>
-      <w:r>
-        <w:t xml:space="preserve">Yıllık güncellenen tutarlar (asgari ücret tarifesi, yeniden değerleme tutarları, tecil eşikleri) doğru cevap yapılmadı; gerektiğinde tutar soruda veri olarak verildi.</w:t>
-      </w:r>
-    </w:p>
-    <w:p>
-      <w:pPr>
-        <w:numPr>
-          <w:ilvl w:val="0"/>
-          <w:numId w:val="1004"/>
-        </w:numPr>
-        <w:pStyle w:val="Compact"/>
-      </w:pPr>
-      <w:r>
         <w:t xml:space="preserve">HS 2027 değişikliklerinin metni depoda olmadığı için tarife soruları HS 2022 nomenklatürüne göre.</w:t>
       </w:r>
     </w:p>
-    <w:bookmarkEnd w:id="25"/>
     <w:bookmarkEnd w:id="26"/>
+    <w:bookmarkEnd w:id="27"/>
     <w:sectPr/>
   </w:body>
 </w:document>
@@ -1363,6 +1625,82 @@
       </w:pPr>
     </w:lvl>
   </w:abstractNum>
+  <w:abstractNum w:abstractNumId="991">
+    <w:nsid w:val="A991"/>
+    <w:multiLevelType w:val="multilevel"/>
+    <w:lvl w:ilvl="0">
+      <w:numFmt w:val="bullet"/>
+      <w:lvlText w:val="•"/>
+      <w:lvlJc w:val="left"/>
+      <w:pPr>
+        <w:ind w:left="720" w:hanging="480"/>
+      </w:pPr>
+    </w:lvl>
+    <w:lvl w:ilvl="1">
+      <w:numFmt w:val="bullet"/>
+      <w:lvlText w:val="–"/>
+      <w:lvlJc w:val="left"/>
+      <w:pPr>
+        <w:ind w:left="1440" w:hanging="480"/>
+      </w:pPr>
+    </w:lvl>
+    <w:lvl w:ilvl="2">
+      <w:numFmt w:val="bullet"/>
+      <w:lvlText w:val="•"/>
+      <w:lvlJc w:val="left"/>
+      <w:pPr>
+        <w:ind w:left="2160" w:hanging="480"/>
+      </w:pPr>
+    </w:lvl>
+    <w:lvl w:ilvl="3">
+      <w:numFmt w:val="bullet"/>
+      <w:lvlText w:val="–"/>
+      <w:lvlJc w:val="left"/>
+      <w:pPr>
+        <w:ind w:left="2880" w:hanging="480"/>
+      </w:pPr>
+    </w:lvl>
+    <w:lvl w:ilvl="4">
+      <w:numFmt w:val="bullet"/>
+      <w:lvlText w:val="•"/>
+      <w:lvlJc w:val="left"/>
+      <w:pPr>
+        <w:ind w:left="3600" w:hanging="480"/>
+      </w:pPr>
+    </w:lvl>
+    <w:lvl w:ilvl="5">
+      <w:numFmt w:val="bullet"/>
+      <w:lvlText w:val="–"/>
+      <w:lvlJc w:val="left"/>
+      <w:pPr>
+        <w:ind w:left="4320" w:hanging="480"/>
+      </w:pPr>
+    </w:lvl>
+    <w:lvl w:ilvl="6">
+      <w:numFmt w:val="bullet"/>
+      <w:lvlText w:val="•"/>
+      <w:lvlJc w:val="left"/>
+      <w:pPr>
+        <w:ind w:left="5040" w:hanging="480"/>
+      </w:pPr>
+    </w:lvl>
+    <w:lvl w:ilvl="7">
+      <w:numFmt w:val="bullet"/>
+      <w:lvlText w:val="–"/>
+      <w:lvlJc w:val="left"/>
+      <w:pPr>
+        <w:ind w:left="5760" w:hanging="480"/>
+      </w:pPr>
+    </w:lvl>
+    <w:lvl w:ilvl="8">
+      <w:numFmt w:val="bullet"/>
+      <w:lvlText w:val="•"/>
+      <w:lvlJc w:val="left"/>
+      <w:pPr>
+        <w:ind w:left="6480" w:hanging="480"/>
+      </w:pPr>
+    </w:lvl>
+  </w:abstractNum>
   <w:abstractNum w:abstractNumId="99411">
     <w:nsid w:val="A99411"/>
     <w:multiLevelType w:val="multilevel"/>
@@ -1448,114 +1786,11 @@
       </w:pPr>
     </w:lvl>
   </w:abstractNum>
-  <w:abstractNum w:abstractNumId="991">
-    <w:nsid w:val="A991"/>
-    <w:multiLevelType w:val="multilevel"/>
-    <w:lvl w:ilvl="0">
-      <w:numFmt w:val="bullet"/>
-      <w:lvlText w:val="•"/>
-      <w:lvlJc w:val="left"/>
-      <w:pPr>
-        <w:ind w:left="720" w:hanging="480"/>
-      </w:pPr>
-    </w:lvl>
-    <w:lvl w:ilvl="1">
-      <w:numFmt w:val="bullet"/>
-      <w:lvlText w:val="–"/>
-      <w:lvlJc w:val="left"/>
-      <w:pPr>
-        <w:ind w:left="1440" w:hanging="480"/>
-      </w:pPr>
-    </w:lvl>
-    <w:lvl w:ilvl="2">
-      <w:numFmt w:val="bullet"/>
-      <w:lvlText w:val="•"/>
-      <w:lvlJc w:val="left"/>
-      <w:pPr>
-        <w:ind w:left="2160" w:hanging="480"/>
-      </w:pPr>
-    </w:lvl>
-    <w:lvl w:ilvl="3">
-      <w:numFmt w:val="bullet"/>
-      <w:lvlText w:val="–"/>
-      <w:lvlJc w:val="left"/>
-      <w:pPr>
-        <w:ind w:left="2880" w:hanging="480"/>
-      </w:pPr>
-    </w:lvl>
-    <w:lvl w:ilvl="4">
-      <w:numFmt w:val="bullet"/>
-      <w:lvlText w:val="•"/>
-      <w:lvlJc w:val="left"/>
-      <w:pPr>
-        <w:ind w:left="3600" w:hanging="480"/>
-      </w:pPr>
-    </w:lvl>
-    <w:lvl w:ilvl="5">
-      <w:numFmt w:val="bullet"/>
-      <w:lvlText w:val="–"/>
-      <w:lvlJc w:val="left"/>
-      <w:pPr>
-        <w:ind w:left="4320" w:hanging="480"/>
-      </w:pPr>
-    </w:lvl>
-    <w:lvl w:ilvl="6">
-      <w:numFmt w:val="bullet"/>
-      <w:lvlText w:val="•"/>
-      <w:lvlJc w:val="left"/>
-      <w:pPr>
-        <w:ind w:left="5040" w:hanging="480"/>
-      </w:pPr>
-    </w:lvl>
-    <w:lvl w:ilvl="7">
-      <w:numFmt w:val="bullet"/>
-      <w:lvlText w:val="–"/>
-      <w:lvlJc w:val="left"/>
-      <w:pPr>
-        <w:ind w:left="5760" w:hanging="480"/>
-      </w:pPr>
-    </w:lvl>
-    <w:lvl w:ilvl="8">
-      <w:numFmt w:val="bullet"/>
-      <w:lvlText w:val="•"/>
-      <w:lvlJc w:val="left"/>
-      <w:pPr>
-        <w:ind w:left="6480" w:hanging="480"/>
-      </w:pPr>
-    </w:lvl>
-  </w:abstractNum>
   <w:num w:numId="1000">
     <w:abstractNumId w:val="990"/>
   </w:num>
   <w:num w:numId="1001">
-    <w:abstractNumId w:val="99411"/>
-    <w:lvlOverride w:ilvl="0">
-      <w:startOverride w:val="1"/>
-    </w:lvlOverride>
-    <w:lvlOverride w:ilvl="1">
-      <w:startOverride w:val="1"/>
-    </w:lvlOverride>
-    <w:lvlOverride w:ilvl="2">
-      <w:startOverride w:val="1"/>
-    </w:lvlOverride>
-    <w:lvlOverride w:ilvl="3">
-      <w:startOverride w:val="1"/>
-    </w:lvlOverride>
-    <w:lvlOverride w:ilvl="4">
-      <w:startOverride w:val="1"/>
-    </w:lvlOverride>
-    <w:lvlOverride w:ilvl="5">
-      <w:startOverride w:val="1"/>
-    </w:lvlOverride>
-    <w:lvlOverride w:ilvl="6">
-      <w:startOverride w:val="1"/>
-    </w:lvlOverride>
-    <w:lvlOverride w:ilvl="7">
-      <w:startOverride w:val="1"/>
-    </w:lvlOverride>
-    <w:lvlOverride w:ilvl="8">
-      <w:startOverride w:val="1"/>
-    </w:lvlOverride>
+    <w:abstractNumId w:val="991"/>
   </w:num>
   <w:num w:numId="1002">
     <w:abstractNumId w:val="99411"/>
@@ -1588,12 +1823,42 @@
     </w:lvlOverride>
   </w:num>
   <w:num w:numId="1003">
-    <w:abstractNumId w:val="991"/>
+    <w:abstractNumId w:val="99411"/>
+    <w:lvlOverride w:ilvl="0">
+      <w:startOverride w:val="1"/>
+    </w:lvlOverride>
+    <w:lvlOverride w:ilvl="1">
+      <w:startOverride w:val="1"/>
+    </w:lvlOverride>
+    <w:lvlOverride w:ilvl="2">
+      <w:startOverride w:val="1"/>
+    </w:lvlOverride>
+    <w:lvlOverride w:ilvl="3">
+      <w:startOverride w:val="1"/>
+    </w:lvlOverride>
+    <w:lvlOverride w:ilvl="4">
+      <w:startOverride w:val="1"/>
+    </w:lvlOverride>
+    <w:lvlOverride w:ilvl="5">
+      <w:startOverride w:val="1"/>
+    </w:lvlOverride>
+    <w:lvlOverride w:ilvl="6">
+      <w:startOverride w:val="1"/>
+    </w:lvlOverride>
+    <w:lvlOverride w:ilvl="7">
+      <w:startOverride w:val="1"/>
+    </w:lvlOverride>
+    <w:lvlOverride w:ilvl="8">
+      <w:startOverride w:val="1"/>
+    </w:lvlOverride>
   </w:num>
   <w:num w:numId="1004">
     <w:abstractNumId w:val="991"/>
   </w:num>
   <w:num w:numId="1005">
+    <w:abstractNumId w:val="991"/>
+  </w:num>
+  <w:num w:numId="1006">
     <w:abstractNumId w:val="991"/>
   </w:num>
 </w:numbering>

</xml_diff>